<commit_message>
docs: add REFERENCES.md, sync citation mapping table, and update DOCX/notebook citations
</commit_message>
<xml_diff>
--- a/NguyenBachTung_BaoCao_CuoiKy.docx
+++ b/NguyenBachTung_BaoCao_CuoiKy.docx
@@ -7694,7 +7694,7 @@
           <w:rFonts w:ascii="Times New Roman" w:hAnsi="Times New Roman" w:cs="Times New Roman"/>
         </w:rPr>
         <w:br/>
-        <w:t>• Nhóm 2 - Các mô hình học sâu sinh dữ liệu (deep generative models): Nổi bật nhất là mạng đối nghịch tạo sinh (generative adversarial networks – GAN) và mạng tự mã hóa biến phân (variational autoencoders – VAE). Mặc dù GAN có khả năng sinh ra dữ liệu sắc nét, quá trình huấn luyện GAN trên chuỗi thời gian gia tốc thường cực kỳ bất ổn định, dễ gặp hiện tượng sụp đổ mốt (mode collapse - chỉ sinh ra một vài dạng sóng lặp đi lặp lại) và khó kiểm soát việc tạo dữ liệu theo đúng nhãn.</w:t>
+        <w:t>• Nhóm 2 - Các mô hình học sâu sinh dữ liệu (deep generative models): Nổi bật nhất là mạng đối nghịch tạo sinh (generative adversarial networks – GAN [6]) và mạng tự mã hóa biến phân (variational autoencoders – VAE). Mặc dù GAN có khả năng sinh ra dữ liệu sắc nét, quá trình huấn luyện GAN trên chuỗi thời gian gia tốc thường cực kỳ bất ổn định, dễ gặp hiện tượng sụp đổ mốt (mode collapse - chỉ sinh ra một vài dạng sóng lặp đi lặp lại) và khó kiểm soát việc tạo dữ liệu theo đúng nhãn.</w:t>
       </w:r>
     </w:p>
     <w:p>
@@ -7998,7 +7998,7 @@
         <w:rPr>
           <w:rFonts w:ascii="Times New Roman" w:hAnsi="Times New Roman" w:cs="Times New Roman"/>
         </w:rPr>
-        <w:t>Tập dữ liệu PPG-DaLiA (PPG Dataset for Motion-Compensated Heart Rate Acquisition in Daily Life Activities) được công bố bởi nhóm nghiên cứu của Reiss và các cộng sự vào năm 2019 (Sensors, 2019 / UCI Machine Learning Repository [1]). Đây là một trong những bộ dữ liệu chuẩn quốc tế uy tín và chân thực nhất hiện nay trong lĩnh vực tính toán đeo (wearable computing). Dữ liệu được thu thập từ 15 tình nguyện viên khỏe mạnh (ký hiệu từ S1 đến S15, gồm 8 nam và 7 nữ, độ tuổi từ 21 đến 55, chiều cao từ 164 đến 190 cm, cân nặng từ 56 đến 98 kg). Quá trình ghi nhận dữ liệu diễn ra liên tục trong hơn 2,5 giờ cho mỗi người, trải dài qua nhiều bối cảnh khác nhau: từ các hoạt động có kiểm soát trong nhà đến các sinh hoạt tự do ngoài trời.</w:t>
+        <w:t>Tập dữ liệu PPG-DaLiA (PPG Dataset for Motion-Compensated Heart Rate Acquisition in Daily Life Activities) được công bố bởi nhóm nghiên cứu của Reiss và các cộng sự vào năm 2019 (Sensors, 2019 [2] / UCI Machine Learning Repository [1]). Đây là một trong những bộ dữ liệu chuẩn quốc tế uy tín và chân thực nhất hiện nay trong lĩnh vực tính toán đeo (wearable computing). Dữ liệu được thu thập từ 15 tình nguyện viên khỏe mạnh (ký hiệu từ S1 đến S15, gồm 8 nam và 7 nữ, độ tuổi từ 21 đến 55, chiều cao từ 164 đến 190 cm, cân nặng từ 56 đến 98 kg). Quá trình ghi nhận dữ liệu diễn ra liên tục trong hơn 2,5 giờ cho mỗi người, trải dài qua nhiều bối cảnh khác nhau: từ các hoạt động có kiểm soát trong nhà đến các sinh hoạt tự do ngoài trời.</w:t>
       </w:r>
     </w:p>
     <w:p>
@@ -8355,7 +8355,7 @@
           <w:sz w:val="24"/>
           <w:szCs w:val="22"/>
         </w:rPr>
-        <w:t>2.5. Chiến lược chia tập theo đối tượng và chuẩn hóa chống rò rỉ dữ liệu</w:t>
+        <w:t>2.5. Chiến lược chia tập theo đối tượng và chuẩn hóa chống rò rỉ dữ liệu [9]</w:t>
       </w:r>
       <w:bookmarkEnd w:id="13"/>
     </w:p>
@@ -11914,7 +11914,7 @@
           <w:rFonts w:ascii="Times New Roman" w:hAnsi="Times New Roman" w:cs="Times New Roman"/>
         </w:rPr>
         <w:br/>
-        <w:t xml:space="preserve">4. Khoảng cách phân phối biased MMD² (108 chiều): Đo lường sự sai khác phân phối xác suất giữa tập kiểm định thật và tập dữ liệu sinh nhân tạo. Không gian đặc trưng 108 chiều bao gồm 9 đặc trưng thống kê miền thời gian (mean, std, RMS trên 3 trục) và 99 đặc trưng mật độ phổ công suất log-Welch log(PSD + 10^-8) của 3 trục (mỗi trục 33 dải tần số từ 0 đến 16 Hz). Băng thông cơ sở σ0 = 11,1942 </w:t>
+        <w:t xml:space="preserve">4. Khoảng cách phân phối biased MMD² (108 chiều) [7]: Đo lường sự sai khác phân phối xác suất giữa tập kiểm định thật và tập dữ liệu sinh nhân tạo. Không gian đặc trưng 108 chiều bao gồm 9 đặc trưng thống kê miền thời gian (mean, std, RMS trên 3 trục) và 99 đặc trưng mật độ phổ công suất log-Welch log(PSD + 10^-8) của 3 trục (mỗi trục 33 dải tần số từ 0 đến 16 Hz). Băng thông cơ sở σ0 = 11,1942 </w:t>
       </w:r>
       <w:r>
         <w:rPr>
@@ -11928,7 +11928,7 @@
           <w:rFonts w:ascii="Times New Roman" w:hAnsi="Times New Roman" w:cs="Times New Roman"/>
         </w:rPr>
         <w:br/>
-        <w:t>5. Khoảng cách hình dạng phổ Welch (d_PSD): Ước lượng mật độ phổ công suất bằng phương pháp Welch (fs = 32 Hz, cửa sổ Hann tuần hoàn 64 điểm, chồng lấn 32 điểm, nfft=64). Chỉ số d_PSD là khoảng cách L1 giữa hai mật độ phổ trung bình đã được chuẩn hóa diện tích tổng công suất về 1.</w:t>
+        <w:t>5. Khoảng cách hình dạng phổ Welch (d_PSD): Ước lượng mật độ phổ công suất bằng phương pháp Welch [10] (fs = 32 Hz, cửa sổ Hann tuần hoàn 64 điểm, chồng lấn 32 điểm, nfft=64). Chỉ số d_PSD là khoảng cách L1 giữa hai mật độ phổ trung bình đã được chuẩn hóa diện tích tổng công suất về 1.</w:t>
       </w:r>
     </w:p>
     <w:p>
@@ -13647,7 +13647,7 @@
         <w:rPr>
           <w:rFonts w:ascii="Times New Roman" w:hAnsi="Times New Roman" w:cs="Times New Roman"/>
         </w:rPr>
-        <w:t>Để đánh giá chất lượng của mô hình sinh 1D-cVAE mà không phụ thuộc vào bộ phân loại downstream, đề tài thực hiện đo đạc các thước đo phân phối và phổ tần số độc lập. Bảng 3 trình bày chi tiết khoảng cách biased MMD² 108 chiều giữa tập test và dữ liệu sinh cVAE (so với mốc đối chứng test và train thật), khoảng cách hình dạng phổ Welch L1 (d_PSD), hệ số xác định phổ R² và công suất trung bình tín hiệu theo từng lớp.</w:t>
+        <w:t>Để đánh giá chất lượng của mô hình sinh 1D-cVAE mà không phụ thuộc vào bộ phân loại downstream, đề tài thực hiện đo đạc các thước đo phân phối và phổ tần số độc lập. Bảng 3 trình bày chi tiết khoảng cách biased MMD² 108 chiều giữa tập test và dữ liệu sinh cVAE (so với mốc đối chứng test và train thật), khoảng cách hình dạng phổ Welch L1 (d_PSD), hệ số xác định phổ R² [11] và công suất trung bình tín hiệu theo từng lớp.</w:t>
       </w:r>
     </w:p>
     <w:p>

</xml_diff>